<commit_message>
The Dolphins' View of History: rescore 7.8 -> 8.7. Build is the master again (About the Author and review line ported into _generate.js), static linked contents page instead of a Word TOC field, curly apostrophes and en-dash ranges in every run, 274 verified source links (Crossref DOI / Open Library / official pages, titles as link text, no printed URLs), two text fixes, new front (1600x2560) and text-only back covers with scripts; old docx in bak
</commit_message>
<xml_diff>
--- a/The Dolphins' View of History/chapters/00 - Prologue - Humans Have Ape Ancestors.docx
+++ b/The Dolphins' View of History/chapters/00 - Prologue - Humans Have Ape Ancestors.docx
@@ -9,6 +9,7 @@
         <w:jc w:val="center"/>
         <w:outlineLvl w:val="0"/>
       </w:pPr>
+      <w:bookmarkStart w:name="_Chapter001" w:id="1"/>
       <w:r>
         <w:rPr>
           <w:rFonts w:ascii="Amazon Ember" w:cs="Amazon Ember" w:eastAsia="Amazon Ember" w:hAnsi="Amazon Ember"/>
@@ -20,6 +21,7 @@
         </w:rPr>
         <w:t xml:space="preserve">Prologue: Humans Have Ape Ancestors</w:t>
       </w:r>
+      <w:bookmarkEnd w:id="1"/>
     </w:p>
     <w:p>
       <w:pPr>
@@ -82,15 +84,15 @@
         <w:spacing w:after="200"/>
       </w:pPr>
       <w:r>
-        <w:t xml:space="preserve">Not this book's kind of watching yet. No history, no verdicts. Just watching, the way any species watches whatever lives nearby.</w:t>
-      </w:r>
-    </w:p>
-    <w:p>
-      <w:pPr>
-        <w:spacing w:after="200"/>
-      </w:pPr>
-      <w:r>
-        <w:t xml:space="preserve">Even the land's earliest chapters met with dolphin approval. Giant reptiles once ruled the ground and, less famously, the sea, where several of them were large, toothy, and unpleasant to swim near. Then an asteroid struck, and dolphin historians, reviewing the record, allow themselves one of their few unqualified endorsements.</w:t>
+        <w:t xml:space="preserve">Not this book’s kind of watching yet. No history, no verdicts. Just watching, the way any species watches whatever lives nearby.</w:t>
+      </w:r>
+    </w:p>
+    <w:p>
+      <w:pPr>
+        <w:spacing w:after="200"/>
+      </w:pPr>
+      <w:r>
+        <w:t xml:space="preserve">Even the land’s earliest chapters met with dolphin approval. Giant reptiles once ruled the ground and, less famously, the sea, where several of them were large, toothy, and unpleasant to swim near. Then an asteroid struck, and dolphin historians, reviewing the record, allow themselves one of their few unqualified endorsements.</w:t>
       </w:r>
     </w:p>
     <w:p>
@@ -222,7 +224,7 @@
         <w:spacing w:after="200"/>
       </w:pPr>
       <w:r>
-        <w:t xml:space="preserve">Dolphin historians are careful about one detail. Walking upright came first. Australopithecus was standing and walking on two legs more than three million years ago, with a brain not much larger than a chimpanzee's. The big brain came later, and came slowly.</w:t>
+        <w:t xml:space="preserve">Dolphin historians are careful about one detail. Walking upright came first. Australopithecus was standing and walking on two legs more than three million years ago, with a brain not much larger than a chimpanzee’s. The big brain came later, and came slowly.</w:t>
       </w:r>
     </w:p>
     <w:p>

</xml_diff>

<commit_message>
The Dolphins' View of History: rescore 8.7, linked sources, static contents, covers (from book-2-lectures-after-qed b696060)
</commit_message>
<xml_diff>
--- a/The Dolphins' View of History/chapters/00 - Prologue - Humans Have Ape Ancestors.docx
+++ b/The Dolphins' View of History/chapters/00 - Prologue - Humans Have Ape Ancestors.docx
@@ -9,6 +9,7 @@
         <w:jc w:val="center"/>
         <w:outlineLvl w:val="0"/>
       </w:pPr>
+      <w:bookmarkStart w:name="_Chapter001" w:id="1"/>
       <w:r>
         <w:rPr>
           <w:rFonts w:ascii="Amazon Ember" w:cs="Amazon Ember" w:eastAsia="Amazon Ember" w:hAnsi="Amazon Ember"/>
@@ -20,6 +21,7 @@
         </w:rPr>
         <w:t xml:space="preserve">Prologue: Humans Have Ape Ancestors</w:t>
       </w:r>
+      <w:bookmarkEnd w:id="1"/>
     </w:p>
     <w:p>
       <w:pPr>
@@ -82,15 +84,15 @@
         <w:spacing w:after="200"/>
       </w:pPr>
       <w:r>
-        <w:t xml:space="preserve">Not this book's kind of watching yet. No history, no verdicts. Just watching, the way any species watches whatever lives nearby.</w:t>
-      </w:r>
-    </w:p>
-    <w:p>
-      <w:pPr>
-        <w:spacing w:after="200"/>
-      </w:pPr>
-      <w:r>
-        <w:t xml:space="preserve">Even the land's earliest chapters met with dolphin approval. Giant reptiles once ruled the ground and, less famously, the sea, where several of them were large, toothy, and unpleasant to swim near. Then an asteroid struck, and dolphin historians, reviewing the record, allow themselves one of their few unqualified endorsements.</w:t>
+        <w:t xml:space="preserve">Not this book’s kind of watching yet. No history, no verdicts. Just watching, the way any species watches whatever lives nearby.</w:t>
+      </w:r>
+    </w:p>
+    <w:p>
+      <w:pPr>
+        <w:spacing w:after="200"/>
+      </w:pPr>
+      <w:r>
+        <w:t xml:space="preserve">Even the land’s earliest chapters met with dolphin approval. Giant reptiles once ruled the ground and, less famously, the sea, where several of them were large, toothy, and unpleasant to swim near. Then an asteroid struck, and dolphin historians, reviewing the record, allow themselves one of their few unqualified endorsements.</w:t>
       </w:r>
     </w:p>
     <w:p>
@@ -222,7 +224,7 @@
         <w:spacing w:after="200"/>
       </w:pPr>
       <w:r>
-        <w:t xml:space="preserve">Dolphin historians are careful about one detail. Walking upright came first. Australopithecus was standing and walking on two legs more than three million years ago, with a brain not much larger than a chimpanzee's. The big brain came later, and came slowly.</w:t>
+        <w:t xml:space="preserve">Dolphin historians are careful about one detail. Walking upright came first. Australopithecus was standing and walking on two legs more than three million years ago, with a brain not much larger than a chimpanzee’s. The big brain came later, and came slowly.</w:t>
       </w:r>
     </w:p>
     <w:p>

</xml_diff>

<commit_message>
Dolphins: re-audit clean, trim 'in this book' asides, apply new all-books heading rule
Re-audit found no open issues (other sessions' recent passes were already
correct). Cut the "in this book" aside count from 65 to 28 with
chapter-specific rewording, synced to the .md track, verified clean on
check_repeats.js. Also records and applies Lothar's new standing rule
for every book's headings (bold, 16pt, dark-to-medium blue, centered,
page break before every top-level heading, Kindle-shaped page instead
of US Letter/A4) in LOTHAR_RULES.md and in this book's own build script.

Co-Authored-By: Claude Sonnet 5 <noreply@anthropic.com>
Claude-Session: https://claude.ai/code/session_01No3CTqqXoAC7DqUj3kRTnA
</commit_message>
<xml_diff>
--- a/The Dolphins' View of History/chapters/00 - Prologue - Humans Have Ape Ancestors.docx
+++ b/The Dolphins' View of History/chapters/00 - Prologue - Humans Have Ape Ancestors.docx
@@ -5,6 +5,7 @@
     <w:p>
       <w:pPr>
         <w:pStyle w:val="Heading1"/>
+        <w:pageBreakBefore/>
         <w:spacing w:after="300"/>
         <w:jc w:val="center"/>
         <w:outlineLvl w:val="0"/>
@@ -15,9 +16,9 @@
           <w:rFonts w:ascii="Amazon Ember" w:cs="Amazon Ember" w:eastAsia="Amazon Ember" w:hAnsi="Amazon Ember"/>
           <w:b/>
           <w:bCs/>
-          <w:color w:val="0000FF"/>
-          <w:sz w:val="36"/>
-          <w:szCs w:val="36"/>
+          <w:color w:val="1F4E79"/>
+          <w:sz w:val="32"/>
+          <w:szCs w:val="32"/>
         </w:rPr>
         <w:t xml:space="preserve">Prologue: Humans Have Ape Ancestors</w:t>
       </w:r>
@@ -280,7 +281,7 @@
       </w:r>
     </w:p>
     <w:sectPr>
-      <w:pgSz w:w="12240" w:h="15840" w:orient="portrait"/>
+      <w:pgSz w:w="8640" w:h="12960" w:orient="portrait"/>
       <w:pgMar w:top="1440" w:right="1440" w:bottom="1440" w:left="1440" w:header="708" w:footer="708" w:gutter="0"/>
       <w:pgNumType/>
       <w:docGrid w:linePitch="360"/>

</xml_diff>

<commit_message>
Dolphins: re-audit clean, trim 'in this book' asides, apply new all-books heading rule (#77)
Re-audit found no open issues (other sessions' recent passes were already
correct). Cut the "in this book" aside count from 65 to 28 with
chapter-specific rewording, synced to the .md track, verified clean on
check_repeats.js. Also records and applies Lothar's new standing rule
for every book's headings (bold, 16pt, dark-to-medium blue, centered,
page break before every top-level heading, Kindle-shaped page instead
of US Letter/A4) in LOTHAR_RULES.md and in this book's own build script.


Claude-Session: https://claude.ai/code/session_01No3CTqqXoAC7DqUj3kRTnA

Co-authored-by: Claude <noreply@anthropic.com>
</commit_message>
<xml_diff>
--- a/The Dolphins' View of History/chapters/00 - Prologue - Humans Have Ape Ancestors.docx
+++ b/The Dolphins' View of History/chapters/00 - Prologue - Humans Have Ape Ancestors.docx
@@ -5,6 +5,7 @@
     <w:p>
       <w:pPr>
         <w:pStyle w:val="Heading1"/>
+        <w:pageBreakBefore/>
         <w:spacing w:after="300"/>
         <w:jc w:val="center"/>
         <w:outlineLvl w:val="0"/>
@@ -15,9 +16,9 @@
           <w:rFonts w:ascii="Amazon Ember" w:cs="Amazon Ember" w:eastAsia="Amazon Ember" w:hAnsi="Amazon Ember"/>
           <w:b/>
           <w:bCs/>
-          <w:color w:val="0000FF"/>
-          <w:sz w:val="36"/>
-          <w:szCs w:val="36"/>
+          <w:color w:val="1F4E79"/>
+          <w:sz w:val="32"/>
+          <w:szCs w:val="32"/>
         </w:rPr>
         <w:t xml:space="preserve">Prologue: Humans Have Ape Ancestors</w:t>
       </w:r>
@@ -280,7 +281,7 @@
       </w:r>
     </w:p>
     <w:sectPr>
-      <w:pgSz w:w="12240" w:h="15840" w:orient="portrait"/>
+      <w:pgSz w:w="8640" w:h="12960" w:orient="portrait"/>
       <w:pgMar w:top="1440" w:right="1440" w:bottom="1440" w:left="1440" w:header="708" w:footer="708" w:gutter="0"/>
       <w:pgNumType/>
       <w:docGrid w:linePitch="360"/>

</xml_diff>